<commit_message>
Update scholarly sources to within last 5 years
Replace the 2010-2014 scholarly references (Kaplan & Haenlein; Kietzmann
et al.; Guidry et al.; Lovejoy & Saxton) with four peer-reviewed sources
published 2023-2025, and update all in-text citations to match:
- Wiley et al. (2023), Public Administration
- DeMasters et al. (2024), Journal of Public and Nonprofit Affairs
- Elvira-Lorilla et al. (2024), Nonprofit and Voluntary Sector Quarterly
- Bhati & McDonnell (2025), Nonprofit and Voluntary Sector Quarterly

Co-Authored-By: Claude Opus 4.8 <noreply@anthropic.com>
Claude-Session: https://claude.ai/code/session_016rfftkLwyHJFG4LX66v37b
</commit_message>
<xml_diff>
--- a/Shood_Digital_PR_Campaign_Plan.docx
+++ b/Shood_Digital_PR_Campaign_Plan.docx
@@ -203,7 +203,7 @@
           <w:sz w:val="24"/>
           <w:szCs w:val="24"/>
         </w:rPr>
-        <w:t xml:space="preserve">The primary target public for this campaign is Richmond-area active adults ages 25 to 45—recreational runners, walkers, and fitness enthusiasts who already own athletic footwear and cycle through shoes regularly. Research on nonprofit audiences shows that donors who feel a personal, values-based connection to a cause are far more likely to give and to advocate on the organization’s behalf (Lovejoy &amp; Saxton, 2012). This segment is attractive for Shood because members possess the exact resource the organization needs—running shoes—and they identify with the physical and emotional benefits of a good, well-fitted pair. A secondary public includes local businesses, running clubs, and civic groups that can host collection drives and corporate matches.</w:t>
+        <w:t xml:space="preserve">The primary target public for this campaign is Richmond-area active adults ages 25 to 45—recreational runners, walkers, and fitness enthusiasts who already own athletic footwear and cycle through shoes regularly. Research on nonprofit fundraising shows that an organization’s social media engagement—the size and activity of its online community—is a meaningful driver of the donations it ultimately receives (Elvira-Lorilla et al., 2024). This segment is attractive for Shood because members possess the exact resource the organization needs—running shoes—and they identify with the physical and emotional benefits of a good, well-fitted pair. A secondary public includes local businesses, running clubs, and civic groups that can host collection drives and corporate matches.</w:t>
       </w:r>
     </w:p>
     <w:p>
@@ -217,7 +217,7 @@
           <w:sz w:val="24"/>
           <w:szCs w:val="24"/>
         </w:rPr>
-        <w:t xml:space="preserve">Research on media use indicates that this age group is highly mobile and visually oriented. They consume short-form video, follow lifestyle and fitness accounts, and respond to authentic, story-driven content rather than overt solicitation (Kaplan &amp; Haenlein, 2010). They track workouts on smartphone applications, share race photos, and participate in community challenges. The content that most interests them centers on transformation stories, behind-the-scenes glimpses of volunteer work, practical fitness tips, and clear, tangible evidence of impact—how many pairs were distributed and whose life changed. Emotionally resonant, shareable content that lets supporters see themselves as part of the mission is therefore the strategic priority.</w:t>
+        <w:t xml:space="preserve">Research on media use indicates that this age group is highly mobile and visually oriented. They consume short-form video, follow lifestyle and fitness accounts, and respond to authentic, story-driven content rather than overt solicitation; studies of nonprofit engagement find that authenticity, not polish, is what earns attention and connection on newer platforms (DeMasters et al., 2024). They track workouts on smartphone applications, share race photos, and participate in community challenges. The content that most interests them centers on transformation stories, behind-the-scenes glimpses of volunteer work, practical fitness tips, and clear, tangible evidence of impact—how many pairs were distributed and whose life changed. Emotionally resonant, shareable content that lets supporters see themselves as part of the mission is therefore the strategic priority.</w:t>
       </w:r>
     </w:p>
     <w:p>
@@ -311,7 +311,7 @@
           <w:sz w:val="24"/>
           <w:szCs w:val="24"/>
         </w:rPr>
-        <w:t xml:space="preserve">Social media functions as a set of building blocks—identity, conversations, sharing, presence, and relationships—and effective campaigns select platforms whose strengths match the organization’s goals (Kietzmann et al., 2011). To avoid duplicating content, each platform in this campaign is assigned a distinct role and creative treatment.</w:t>
+        <w:t xml:space="preserve">Each social platform offers distinct strengths, and research shows that nonprofits generate more support when they diversify their messaging across channels rather than recycling identical posts (Bhati &amp; McDonnell, 2025). To avoid duplicating content, each platform in this campaign is therefore assigned a distinct role and creative treatment.</w:t>
       </w:r>
     </w:p>
     <w:p>
@@ -373,7 +373,7 @@
           <w:sz w:val="24"/>
           <w:szCs w:val="24"/>
         </w:rPr>
-        <w:t xml:space="preserve">TikTok is the campaign’s discovery and reach engine. Its primary uses are short-form vertical video and participatory trends, and its features—sounds, duets, stitches, and a discovery-driven algorithm—help small organizations reach audiences far beyond their existing followers (Guidry et al., 2014). It was selected to attract younger runners and to make the campaign shareable through authentic, unpolished “day in the life” and shoe-transformation videos. Where Instagram is refined, TikTok is raw and energetic, ensuring the two platforms never duplicate content.</w:t>
+        <w:t xml:space="preserve">TikTok is the campaign’s discovery and reach engine. Its primary uses are short-form vertical video and participatory trends, and its features—sounds, duets, stitches, and a discovery-driven algorithm—help small organizations reach audiences far beyond their existing followers (Wiley et al., 2023). It was selected to attract younger runners and to make the campaign shareable through authentic, unpolished “day in the life” and shoe-transformation videos. Where Instagram is refined, TikTok is raw and energetic, ensuring the two platforms never duplicate content.</w:t>
       </w:r>
     </w:p>
     <w:p>
@@ -466,7 +466,7 @@
           <w:sz w:val="24"/>
           <w:szCs w:val="24"/>
         </w:rPr>
-        <w:t xml:space="preserve">The blog, hosted on shood.org, is the campaign’s content home and search-visible archive. Nonprofits use owned media to provide depth that social platforms cannot, building community and driving action (Lovejoy &amp; Saxton, 2012). Weekly “Sole to Soul” blog posts will tell one long-form story per week—a volunteer profile, a recipient’s journey, the science of proper shoe fit, and a campaign wrap-up—each ending with a clear call to donate, volunteer, or join the Strava challenge. Social posts will tease and link back to the blog, making it the connective tissue of the campaign.</w:t>
+        <w:t xml:space="preserve">The blog, hosted on shood.org, is the campaign’s content home and search-visible archive. Because active, community-oriented engagement is what converts online attention into donations, owned media that hosts deeper storytelling strengthens the entire campaign (Elvira-Lorilla et al., 2024). Weekly “Sole to Soul” blog posts will tell one long-form story per week—a volunteer profile, a recipient’s journey, the science of proper shoe fit, and a campaign wrap-up—each ending with a clear call to donate, volunteer, or join the Strava challenge. Social posts will tease and link back to the blog, making it the connective tissue of the campaign.</w:t>
       </w:r>
     </w:p>
     <w:p>
@@ -1481,7 +1481,7 @@
           <w:sz w:val="24"/>
           <w:szCs w:val="24"/>
         </w:rPr>
-        <w:t xml:space="preserve">Guidry, J. P. D., Waters, R. D., &amp; Saxton, G. D. (2014). Moving social marketing beyond personal change to social change: Strategically using Twitter to mobilize supporters into vocal advocates. </w:t>
+        <w:t xml:space="preserve">Bhati, A., &amp; McDonnell, D. (2025). Message content and diversity as an effective nonprofit fundraising strategy on social media. </w:t>
       </w:r>
       <w:r>
         <w:rPr>
@@ -1491,15 +1491,15 @@
           <w:sz w:val="24"/>
           <w:szCs w:val="24"/>
         </w:rPr>
-        <w:t xml:space="preserve">Journal of Social Marketing, 4</w:t>
-      </w:r>
-      <w:r>
-        <w:rPr>
-          <w:rFonts w:ascii="Times New Roman" w:cs="Times New Roman" w:eastAsia="Times New Roman" w:hAnsi="Times New Roman"/>
-          <w:sz w:val="24"/>
-          <w:szCs w:val="24"/>
-        </w:rPr>
-        <w:t xml:space="preserve">(3), 240–260. https://doi.org/10.1108/JSOCM-02-2014-0014</w:t>
+        <w:t xml:space="preserve">Nonprofit and Voluntary Sector Quarterly</w:t>
+      </w:r>
+      <w:r>
+        <w:rPr>
+          <w:rFonts w:ascii="Times New Roman" w:cs="Times New Roman" w:eastAsia="Times New Roman" w:hAnsi="Times New Roman"/>
+          <w:sz w:val="24"/>
+          <w:szCs w:val="24"/>
+        </w:rPr>
+        <w:t xml:space="preserve">. Advance online publication. https://doi.org/10.1177/08997640241303920</w:t>
       </w:r>
     </w:p>
     <w:p>
@@ -1513,7 +1513,7 @@
           <w:sz w:val="24"/>
           <w:szCs w:val="24"/>
         </w:rPr>
-        <w:t xml:space="preserve">Kaplan, A. M., &amp; Haenlein, M. (2010). Users of the world, unite! The challenges and opportunities of social media. </w:t>
+        <w:t xml:space="preserve">DeMasters, C., Morgan, K., Schwoerer, K., &amp; Wiley, K. (2024). Forging connections: Nonprofits, TikTok, and authentic engagement—A mixed-methods study. </w:t>
       </w:r>
       <w:r>
         <w:rPr>
@@ -1523,15 +1523,15 @@
           <w:sz w:val="24"/>
           <w:szCs w:val="24"/>
         </w:rPr>
-        <w:t xml:space="preserve">Business Horizons, 53</w:t>
-      </w:r>
-      <w:r>
-        <w:rPr>
-          <w:rFonts w:ascii="Times New Roman" w:cs="Times New Roman" w:eastAsia="Times New Roman" w:hAnsi="Times New Roman"/>
-          <w:sz w:val="24"/>
-          <w:szCs w:val="24"/>
-        </w:rPr>
-        <w:t xml:space="preserve">(1), 59–68. https://doi.org/10.1016/j.bushor.2009.09.003</w:t>
+        <w:t xml:space="preserve">Journal of Public and Nonprofit Affairs, 10</w:t>
+      </w:r>
+      <w:r>
+        <w:rPr>
+          <w:rFonts w:ascii="Times New Roman" w:cs="Times New Roman" w:eastAsia="Times New Roman" w:hAnsi="Times New Roman"/>
+          <w:sz w:val="24"/>
+          <w:szCs w:val="24"/>
+        </w:rPr>
+        <w:t xml:space="preserve">(1), 27–51. https://doi.org/10.20899/jpna.dky82f18</w:t>
       </w:r>
     </w:p>
     <w:p>
@@ -1545,7 +1545,7 @@
           <w:sz w:val="24"/>
           <w:szCs w:val="24"/>
         </w:rPr>
-        <w:t xml:space="preserve">Kietzmann, J. H., Hermkens, K., McCarthy, I. P., &amp; Silvestre, B. S. (2011). Social media? Get serious! Understanding the functional building blocks of social media. </w:t>
+        <w:t xml:space="preserve">Elvira-Lorilla, T., García-Rodríguez, I., Romero-Merino, M. E., &amp; Santamaría-Mariscal, M. (2024). The role of social media in nonprofit organizations’ fundraising. </w:t>
       </w:r>
       <w:r>
         <w:rPr>
@@ -1555,15 +1555,15 @@
           <w:sz w:val="24"/>
           <w:szCs w:val="24"/>
         </w:rPr>
-        <w:t xml:space="preserve">Business Horizons, 54</w:t>
-      </w:r>
-      <w:r>
-        <w:rPr>
-          <w:rFonts w:ascii="Times New Roman" w:cs="Times New Roman" w:eastAsia="Times New Roman" w:hAnsi="Times New Roman"/>
-          <w:sz w:val="24"/>
-          <w:szCs w:val="24"/>
-        </w:rPr>
-        <w:t xml:space="preserve">(3), 241–251. https://doi.org/10.1016/j.bushor.2011.01.005</w:t>
+        <w:t xml:space="preserve">Nonprofit and Voluntary Sector Quarterly, 53</w:t>
+      </w:r>
+      <w:r>
+        <w:rPr>
+          <w:rFonts w:ascii="Times New Roman" w:cs="Times New Roman" w:eastAsia="Times New Roman" w:hAnsi="Times New Roman"/>
+          <w:sz w:val="24"/>
+          <w:szCs w:val="24"/>
+        </w:rPr>
+        <w:t xml:space="preserve">(6), 1353–1380. https://doi.org/10.1177/08997640231213286</w:t>
       </w:r>
     </w:p>
     <w:p>
@@ -1577,7 +1577,7 @@
           <w:sz w:val="24"/>
           <w:szCs w:val="24"/>
         </w:rPr>
-        <w:t xml:space="preserve">Lovejoy, K., &amp; Saxton, G. D. (2012). Information, community, and action: How nonprofit organizations use social media. </w:t>
+        <w:t xml:space="preserve">Luttrell, R. (2021). </w:t>
       </w:r>
       <w:r>
         <w:rPr>
@@ -1587,15 +1587,15 @@
           <w:sz w:val="24"/>
           <w:szCs w:val="24"/>
         </w:rPr>
-        <w:t xml:space="preserve">Journal of Computer-Mediated Communication, 17</w:t>
-      </w:r>
-      <w:r>
-        <w:rPr>
-          <w:rFonts w:ascii="Times New Roman" w:cs="Times New Roman" w:eastAsia="Times New Roman" w:hAnsi="Times New Roman"/>
-          <w:sz w:val="24"/>
-          <w:szCs w:val="24"/>
-        </w:rPr>
-        <w:t xml:space="preserve">(3), 337–353. https://doi.org/10.1111/j.1083-6101.2012.01576.x</w:t>
+        <w:t xml:space="preserve">Social media: How to engage, share, and connect</w:t>
+      </w:r>
+      <w:r>
+        <w:rPr>
+          <w:rFonts w:ascii="Times New Roman" w:cs="Times New Roman" w:eastAsia="Times New Roman" w:hAnsi="Times New Roman"/>
+          <w:sz w:val="24"/>
+          <w:szCs w:val="24"/>
+        </w:rPr>
+        <w:t xml:space="preserve"> (4th ed.). Rowman &amp; Littlefield.</w:t>
       </w:r>
     </w:p>
     <w:p>
@@ -1609,7 +1609,7 @@
           <w:sz w:val="24"/>
           <w:szCs w:val="24"/>
         </w:rPr>
-        <w:t xml:space="preserve">Luttrell, R. (2021). </w:t>
+        <w:t xml:space="preserve">New International Version. (2011). </w:t>
       </w:r>
       <w:r>
         <w:rPr>
@@ -1619,15 +1619,15 @@
           <w:sz w:val="24"/>
           <w:szCs w:val="24"/>
         </w:rPr>
-        <w:t xml:space="preserve">Social media: How to engage, share, and connect</w:t>
-      </w:r>
-      <w:r>
-        <w:rPr>
-          <w:rFonts w:ascii="Times New Roman" w:cs="Times New Roman" w:eastAsia="Times New Roman" w:hAnsi="Times New Roman"/>
-          <w:sz w:val="24"/>
-          <w:szCs w:val="24"/>
-        </w:rPr>
-        <w:t xml:space="preserve"> (4th ed.). Rowman &amp; Littlefield.</w:t>
+        <w:t xml:space="preserve">Bible Gateway</w:t>
+      </w:r>
+      <w:r>
+        <w:rPr>
+          <w:rFonts w:ascii="Times New Roman" w:cs="Times New Roman" w:eastAsia="Times New Roman" w:hAnsi="Times New Roman"/>
+          <w:sz w:val="24"/>
+          <w:szCs w:val="24"/>
+        </w:rPr>
+        <w:t xml:space="preserve">. https://www.biblegateway.com (Original work published 1978)</w:t>
       </w:r>
     </w:p>
     <w:p>
@@ -1641,7 +1641,7 @@
           <w:sz w:val="24"/>
           <w:szCs w:val="24"/>
         </w:rPr>
-        <w:t xml:space="preserve">New International Version. (2011). </w:t>
+        <w:t xml:space="preserve">Telfian, R. (2026, September 3). </w:t>
       </w:r>
       <w:r>
         <w:rPr>
@@ -1651,15 +1651,15 @@
           <w:sz w:val="24"/>
           <w:szCs w:val="24"/>
         </w:rPr>
-        <w:t xml:space="preserve">Bible Gateway</w:t>
-      </w:r>
-      <w:r>
-        <w:rPr>
-          <w:rFonts w:ascii="Times New Roman" w:cs="Times New Roman" w:eastAsia="Times New Roman" w:hAnsi="Times New Roman"/>
-          <w:sz w:val="24"/>
-          <w:szCs w:val="24"/>
-        </w:rPr>
-        <w:t xml:space="preserve">. https://www.biblegateway.com (Original work published 1978)</w:t>
+        <w:t xml:space="preserve">Personal interview with the founder of Shood (Shoes for Good)</w:t>
+      </w:r>
+      <w:r>
+        <w:rPr>
+          <w:rFonts w:ascii="Times New Roman" w:cs="Times New Roman" w:eastAsia="Times New Roman" w:hAnsi="Times New Roman"/>
+          <w:sz w:val="24"/>
+          <w:szCs w:val="24"/>
+        </w:rPr>
+        <w:t xml:space="preserve"> [Client interview]. Richmond, VA.</w:t>
       </w:r>
     </w:p>
     <w:p>
@@ -1673,7 +1673,7 @@
           <w:sz w:val="24"/>
           <w:szCs w:val="24"/>
         </w:rPr>
-        <w:t xml:space="preserve">Telfian, R. (2026, September 3). </w:t>
+        <w:t xml:space="preserve">Wiley, K., Schwoerer, K., Richardson, M., &amp; Espinosa, M. B. (2023). Engaging stakeholders on TikTok: A multi-level social media analysis of nonprofit microvlogging. </w:t>
       </w:r>
       <w:r>
         <w:rPr>
@@ -1683,15 +1683,15 @@
           <w:sz w:val="24"/>
           <w:szCs w:val="24"/>
         </w:rPr>
-        <w:t xml:space="preserve">Personal interview with the founder of Shood (Shoes for Good)</w:t>
-      </w:r>
-      <w:r>
-        <w:rPr>
-          <w:rFonts w:ascii="Times New Roman" w:cs="Times New Roman" w:eastAsia="Times New Roman" w:hAnsi="Times New Roman"/>
-          <w:sz w:val="24"/>
-          <w:szCs w:val="24"/>
-        </w:rPr>
-        <w:t xml:space="preserve"> [Client interview]. Richmond, VA.</w:t>
+        <w:t xml:space="preserve">Public Administration, 101</w:t>
+      </w:r>
+      <w:r>
+        <w:rPr>
+          <w:rFonts w:ascii="Times New Roman" w:cs="Times New Roman" w:eastAsia="Times New Roman" w:hAnsi="Times New Roman"/>
+          <w:sz w:val="24"/>
+          <w:szCs w:val="24"/>
+        </w:rPr>
+        <w:t xml:space="preserve">(3), 822–842. https://doi.org/10.1111/padm.12851</w:t>
       </w:r>
     </w:p>
     <w:sectPr>

</xml_diff>

<commit_message>
Convert implementation timeline from table to week-by-week prose
Replace the timeline grid with four narrative paragraphs (Weeks 1-4),
each covering the weekly theme, platform activity, mobile/blog, and
user-generated content, matching the paper's prose format.

Co-Authored-By: Claude Opus 4.8 <noreply@anthropic.com>
Claude-Session: https://claude.ai/code/session_016rfftkLwyHJFG4LX66v37b
</commit_message>
<xml_diff>
--- a/Shood_Digital_PR_Campaign_Plan.docx
+++ b/Shood_Digital_PR_Campaign_Plan.docx
@@ -775,664 +775,103 @@
           <w:sz w:val="24"/>
           <w:szCs w:val="24"/>
         </w:rPr>
-        <w:t xml:space="preserve">The campaign runs across the four weeks of September 2026. The timeline below coordinates platform activity, mobile engagement, blogging, and user-generated content so that each channel reinforces a shared weekly focus without duplicating content.</w:t>
-      </w:r>
-    </w:p>
-    <w:tbl>
-      <w:tblPr>
-        <w:tblW w:type="dxa" w:w="8700"/>
-        <w:tblBorders>
-          <w:top w:val="single" w:color="auto" w:sz="4"/>
-          <w:left w:val="single" w:color="auto" w:sz="4"/>
-          <w:bottom w:val="single" w:color="auto" w:sz="4"/>
-          <w:right w:val="single" w:color="auto" w:sz="4"/>
-          <w:insideH w:val="single" w:color="auto" w:sz="4"/>
-          <w:insideV w:val="single" w:color="auto" w:sz="4"/>
-        </w:tblBorders>
-      </w:tblPr>
-      <w:tblGrid>
-        <w:gridCol w:w="1200"/>
-        <w:gridCol w:w="2500"/>
-        <w:gridCol w:w="2500"/>
-        <w:gridCol w:w="2500"/>
-      </w:tblGrid>
-      <w:tr>
-        <w:trPr>
-          <w:tblHeader/>
-        </w:trPr>
-        <w:tc>
-          <w:tcPr>
-            <w:tcW w:type="dxa" w:w="1200"/>
-            <w:shd w:fill="2E5395" w:color="auto" w:val="clear"/>
-            <w:tcMar>
-              <w:top w:type="dxa" w:w="60"/>
-              <w:left w:type="dxa" w:w="90"/>
-              <w:bottom w:type="dxa" w:w="60"/>
-              <w:right w:type="dxa" w:w="90"/>
-            </w:tcMar>
-          </w:tcPr>
-          <w:p>
-            <w:pPr>
-              <w:spacing w:line="240"/>
-            </w:pPr>
-            <w:r>
-              <w:rPr>
-                <w:rFonts w:ascii="Times New Roman" w:cs="Times New Roman" w:eastAsia="Times New Roman" w:hAnsi="Times New Roman"/>
-                <w:b/>
-                <w:bCs/>
-                <w:color w:val="FFFFFF"/>
-                <w:sz w:val="20"/>
-                <w:szCs w:val="20"/>
-              </w:rPr>
-              <w:t xml:space="preserve">Week</w:t>
-            </w:r>
-          </w:p>
-        </w:tc>
-        <w:tc>
-          <w:tcPr>
-            <w:tcW w:type="dxa" w:w="2500"/>
-            <w:shd w:fill="2E5395" w:color="auto" w:val="clear"/>
-            <w:tcMar>
-              <w:top w:type="dxa" w:w="60"/>
-              <w:left w:type="dxa" w:w="90"/>
-              <w:bottom w:type="dxa" w:w="60"/>
-              <w:right w:type="dxa" w:w="90"/>
-            </w:tcMar>
-          </w:tcPr>
-          <w:p>
-            <w:pPr>
-              <w:spacing w:line="240"/>
-            </w:pPr>
-            <w:r>
-              <w:rPr>
-                <w:rFonts w:ascii="Times New Roman" w:cs="Times New Roman" w:eastAsia="Times New Roman" w:hAnsi="Times New Roman"/>
-                <w:b/>
-                <w:bCs/>
-                <w:color w:val="FFFFFF"/>
-                <w:sz w:val="20"/>
-                <w:szCs w:val="20"/>
-              </w:rPr>
-              <w:t xml:space="preserve">Theme Focus</w:t>
-            </w:r>
-          </w:p>
-        </w:tc>
-        <w:tc>
-          <w:tcPr>
-            <w:tcW w:type="dxa" w:w="2500"/>
-            <w:shd w:fill="2E5395" w:color="auto" w:val="clear"/>
-            <w:tcMar>
-              <w:top w:type="dxa" w:w="60"/>
-              <w:left w:type="dxa" w:w="90"/>
-              <w:bottom w:type="dxa" w:w="60"/>
-              <w:right w:type="dxa" w:w="90"/>
-            </w:tcMar>
-          </w:tcPr>
-          <w:p>
-            <w:pPr>
-              <w:spacing w:line="240"/>
-            </w:pPr>
-            <w:r>
-              <w:rPr>
-                <w:rFonts w:ascii="Times New Roman" w:cs="Times New Roman" w:eastAsia="Times New Roman" w:hAnsi="Times New Roman"/>
-                <w:b/>
-                <w:bCs/>
-                <w:color w:val="FFFFFF"/>
-                <w:sz w:val="20"/>
-                <w:szCs w:val="20"/>
-              </w:rPr>
-              <w:t xml:space="preserve">Platform Activity</w:t>
-            </w:r>
-          </w:p>
-        </w:tc>
-        <w:tc>
-          <w:tcPr>
-            <w:tcW w:type="dxa" w:w="2500"/>
-            <w:shd w:fill="2E5395" w:color="auto" w:val="clear"/>
-            <w:tcMar>
-              <w:top w:type="dxa" w:w="60"/>
-              <w:left w:type="dxa" w:w="90"/>
-              <w:bottom w:type="dxa" w:w="60"/>
-              <w:right w:type="dxa" w:w="90"/>
-            </w:tcMar>
-          </w:tcPr>
-          <w:p>
-            <w:pPr>
-              <w:spacing w:line="240"/>
-            </w:pPr>
-            <w:r>
-              <w:rPr>
-                <w:rFonts w:ascii="Times New Roman" w:cs="Times New Roman" w:eastAsia="Times New Roman" w:hAnsi="Times New Roman"/>
-                <w:b/>
-                <w:bCs/>
-                <w:color w:val="FFFFFF"/>
-                <w:sz w:val="20"/>
-                <w:szCs w:val="20"/>
-              </w:rPr>
-              <w:t xml:space="preserve">UGC + Mobile/Blog</w:t>
-            </w:r>
-          </w:p>
-        </w:tc>
-      </w:tr>
-      <w:tr>
-        <w:trPr>
-          <w:tblHeader w:val="false"/>
-        </w:trPr>
-        <w:tc>
-          <w:tcPr>
-            <w:tcW w:type="dxa" w:w="1200"/>
-            <w:tcMar>
-              <w:top w:type="dxa" w:w="60"/>
-              <w:left w:type="dxa" w:w="90"/>
-              <w:bottom w:type="dxa" w:w="60"/>
-              <w:right w:type="dxa" w:w="90"/>
-            </w:tcMar>
-          </w:tcPr>
-          <w:p>
-            <w:pPr>
-              <w:spacing w:line="240"/>
-            </w:pPr>
-            <w:r>
-              <w:rPr>
-                <w:rFonts w:ascii="Times New Roman" w:cs="Times New Roman" w:eastAsia="Times New Roman" w:hAnsi="Times New Roman"/>
-                <w:b w:val="false"/>
-                <w:bCs w:val="false"/>
-                <w:color w:val="000000"/>
-                <w:sz w:val="20"/>
-                <w:szCs w:val="20"/>
-              </w:rPr>
-              <w:t xml:space="preserve">Week 1</w:t>
-            </w:r>
-            <w:r>
-              <w:rPr>
-                <w:rFonts w:ascii="Times New Roman" w:cs="Times New Roman" w:eastAsia="Times New Roman" w:hAnsi="Times New Roman"/>
-                <w:b w:val="false"/>
-                <w:bCs w:val="false"/>
-                <w:color w:val="000000"/>
-                <w:sz w:val="20"/>
-                <w:szCs w:val="20"/>
-              </w:rPr>
-              <w:br/>
-              <w:t xml:space="preserve">Sept 1–7</w:t>
-            </w:r>
-          </w:p>
-        </w:tc>
-        <w:tc>
-          <w:tcPr>
-            <w:tcW w:type="dxa" w:w="2500"/>
-            <w:tcMar>
-              <w:top w:type="dxa" w:w="60"/>
-              <w:left w:type="dxa" w:w="90"/>
-              <w:bottom w:type="dxa" w:w="60"/>
-              <w:right w:type="dxa" w:w="90"/>
-            </w:tcMar>
-          </w:tcPr>
-          <w:p>
-            <w:pPr>
-              <w:spacing w:line="240"/>
-            </w:pPr>
-            <w:r>
-              <w:rPr>
-                <w:rFonts w:ascii="Times New Roman" w:cs="Times New Roman" w:eastAsia="Times New Roman" w:hAnsi="Times New Roman"/>
-                <w:b w:val="false"/>
-                <w:bCs w:val="false"/>
-                <w:color w:val="000000"/>
-                <w:sz w:val="20"/>
-                <w:szCs w:val="20"/>
-              </w:rPr>
-              <w:t xml:space="preserve">Launch: “Sole to Soul” reveal</w:t>
-            </w:r>
-          </w:p>
-        </w:tc>
-        <w:tc>
-          <w:tcPr>
-            <w:tcW w:type="dxa" w:w="2500"/>
-            <w:tcMar>
-              <w:top w:type="dxa" w:w="60"/>
-              <w:left w:type="dxa" w:w="90"/>
-              <w:bottom w:type="dxa" w:w="60"/>
-              <w:right w:type="dxa" w:w="90"/>
-            </w:tcMar>
-          </w:tcPr>
-          <w:p>
-            <w:pPr>
-              <w:spacing w:line="240"/>
-            </w:pPr>
-            <w:r>
-              <w:rPr>
-                <w:rFonts w:ascii="Times New Roman" w:cs="Times New Roman" w:eastAsia="Times New Roman" w:hAnsi="Times New Roman"/>
-                <w:b w:val="false"/>
-                <w:bCs w:val="false"/>
-                <w:color w:val="000000"/>
-                <w:sz w:val="20"/>
-                <w:szCs w:val="20"/>
-              </w:rPr>
-              <w:t xml:space="preserve">IG launch carousel; TikTok workshop transformation; FB drive event (Sept. 6)</w:t>
-            </w:r>
-          </w:p>
-        </w:tc>
-        <w:tc>
-          <w:tcPr>
-            <w:tcW w:type="dxa" w:w="2500"/>
-            <w:tcMar>
-              <w:top w:type="dxa" w:w="60"/>
-              <w:left w:type="dxa" w:w="90"/>
-              <w:bottom w:type="dxa" w:w="60"/>
-              <w:right w:type="dxa" w:w="90"/>
-            </w:tcMar>
-          </w:tcPr>
-          <w:p>
-            <w:pPr>
-              <w:spacing w:line="240"/>
-            </w:pPr>
-            <w:r>
-              <w:rPr>
-                <w:rFonts w:ascii="Times New Roman" w:cs="Times New Roman" w:eastAsia="Times New Roman" w:hAnsi="Times New Roman"/>
-                <w:b w:val="false"/>
-                <w:bCs w:val="false"/>
-                <w:color w:val="000000"/>
-                <w:sz w:val="20"/>
-                <w:szCs w:val="20"/>
-              </w:rPr>
-              <w:t xml:space="preserve">#SoleToSoulRVA Photo Challenge; blog: founder’s story; text-to-give goes live</w:t>
-            </w:r>
-          </w:p>
-        </w:tc>
-      </w:tr>
-      <w:tr>
-        <w:trPr>
-          <w:tblHeader w:val="false"/>
-        </w:trPr>
-        <w:tc>
-          <w:tcPr>
-            <w:tcW w:type="dxa" w:w="1200"/>
-            <w:shd w:fill="EAF0FA" w:color="auto" w:val="clear"/>
-            <w:tcMar>
-              <w:top w:type="dxa" w:w="60"/>
-              <w:left w:type="dxa" w:w="90"/>
-              <w:bottom w:type="dxa" w:w="60"/>
-              <w:right w:type="dxa" w:w="90"/>
-            </w:tcMar>
-          </w:tcPr>
-          <w:p>
-            <w:pPr>
-              <w:spacing w:line="240"/>
-            </w:pPr>
-            <w:r>
-              <w:rPr>
-                <w:rFonts w:ascii="Times New Roman" w:cs="Times New Roman" w:eastAsia="Times New Roman" w:hAnsi="Times New Roman"/>
-                <w:b w:val="false"/>
-                <w:bCs w:val="false"/>
-                <w:color w:val="000000"/>
-                <w:sz w:val="20"/>
-                <w:szCs w:val="20"/>
-              </w:rPr>
-              <w:t xml:space="preserve">Week 2</w:t>
-            </w:r>
-            <w:r>
-              <w:rPr>
-                <w:rFonts w:ascii="Times New Roman" w:cs="Times New Roman" w:eastAsia="Times New Roman" w:hAnsi="Times New Roman"/>
-                <w:b w:val="false"/>
-                <w:bCs w:val="false"/>
-                <w:color w:val="000000"/>
-                <w:sz w:val="20"/>
-                <w:szCs w:val="20"/>
-              </w:rPr>
-              <w:br/>
-              <w:t xml:space="preserve">Sept 8–14</w:t>
-            </w:r>
-          </w:p>
-        </w:tc>
-        <w:tc>
-          <w:tcPr>
-            <w:tcW w:type="dxa" w:w="2500"/>
-            <w:shd w:fill="EAF0FA" w:color="auto" w:val="clear"/>
-            <w:tcMar>
-              <w:top w:type="dxa" w:w="60"/>
-              <w:left w:type="dxa" w:w="90"/>
-              <w:bottom w:type="dxa" w:w="60"/>
-              <w:right w:type="dxa" w:w="90"/>
-            </w:tcMar>
-          </w:tcPr>
-          <w:p>
-            <w:pPr>
-              <w:spacing w:line="240"/>
-            </w:pPr>
-            <w:r>
-              <w:rPr>
-                <w:rFonts w:ascii="Times New Roman" w:cs="Times New Roman" w:eastAsia="Times New Roman" w:hAnsi="Times New Roman"/>
-                <w:b w:val="false"/>
-                <w:bCs w:val="false"/>
-                <w:color w:val="000000"/>
-                <w:sz w:val="20"/>
-                <w:szCs w:val="20"/>
-              </w:rPr>
-              <w:t xml:space="preserve">Community: why running matters</w:t>
-            </w:r>
-          </w:p>
-        </w:tc>
-        <w:tc>
-          <w:tcPr>
-            <w:tcW w:type="dxa" w:w="2500"/>
-            <w:shd w:fill="EAF0FA" w:color="auto" w:val="clear"/>
-            <w:tcMar>
-              <w:top w:type="dxa" w:w="60"/>
-              <w:left w:type="dxa" w:w="90"/>
-              <w:bottom w:type="dxa" w:w="60"/>
-              <w:right w:type="dxa" w:w="90"/>
-            </w:tcMar>
-          </w:tcPr>
-          <w:p>
-            <w:pPr>
-              <w:spacing w:line="240"/>
-            </w:pPr>
-            <w:r>
-              <w:rPr>
-                <w:rFonts w:ascii="Times New Roman" w:cs="Times New Roman" w:eastAsia="Times New Roman" w:hAnsi="Times New Roman"/>
-                <w:b w:val="false"/>
-                <w:bCs w:val="false"/>
-                <w:color w:val="000000"/>
-                <w:sz w:val="20"/>
-                <w:szCs w:val="20"/>
-              </w:rPr>
-              <w:t xml:space="preserve">IG Stories “Why I Run”; TikTok runner duets; FB running-club drives</w:t>
-            </w:r>
-          </w:p>
-        </w:tc>
-        <w:tc>
-          <w:tcPr>
-            <w:tcW w:type="dxa" w:w="2500"/>
-            <w:shd w:fill="EAF0FA" w:color="auto" w:val="clear"/>
-            <w:tcMar>
-              <w:top w:type="dxa" w:w="60"/>
-              <w:left w:type="dxa" w:w="90"/>
-              <w:bottom w:type="dxa" w:w="60"/>
-              <w:right w:type="dxa" w:w="90"/>
-            </w:tcMar>
-          </w:tcPr>
-          <w:p>
-            <w:pPr>
-              <w:spacing w:line="240"/>
-            </w:pPr>
-            <w:r>
-              <w:rPr>
-                <w:rFonts w:ascii="Times New Roman" w:cs="Times New Roman" w:eastAsia="Times New Roman" w:hAnsi="Times New Roman"/>
-                <w:b w:val="false"/>
-                <w:bCs w:val="false"/>
-                <w:color w:val="000000"/>
-                <w:sz w:val="20"/>
-                <w:szCs w:val="20"/>
-              </w:rPr>
-              <w:t xml:space="preserve">“Why I Run” Story prompt; blog: volunteer profile</w:t>
-            </w:r>
-          </w:p>
-        </w:tc>
-      </w:tr>
-      <w:tr>
-        <w:trPr>
-          <w:tblHeader w:val="false"/>
-        </w:trPr>
-        <w:tc>
-          <w:tcPr>
-            <w:tcW w:type="dxa" w:w="1200"/>
-            <w:tcMar>
-              <w:top w:type="dxa" w:w="60"/>
-              <w:left w:type="dxa" w:w="90"/>
-              <w:bottom w:type="dxa" w:w="60"/>
-              <w:right w:type="dxa" w:w="90"/>
-            </w:tcMar>
-          </w:tcPr>
-          <w:p>
-            <w:pPr>
-              <w:spacing w:line="240"/>
-            </w:pPr>
-            <w:r>
-              <w:rPr>
-                <w:rFonts w:ascii="Times New Roman" w:cs="Times New Roman" w:eastAsia="Times New Roman" w:hAnsi="Times New Roman"/>
-                <w:b w:val="false"/>
-                <w:bCs w:val="false"/>
-                <w:color w:val="000000"/>
-                <w:sz w:val="20"/>
-                <w:szCs w:val="20"/>
-              </w:rPr>
-              <w:t xml:space="preserve">Week 3</w:t>
-            </w:r>
-            <w:r>
-              <w:rPr>
-                <w:rFonts w:ascii="Times New Roman" w:cs="Times New Roman" w:eastAsia="Times New Roman" w:hAnsi="Times New Roman"/>
-                <w:b w:val="false"/>
-                <w:bCs w:val="false"/>
-                <w:color w:val="000000"/>
-                <w:sz w:val="20"/>
-                <w:szCs w:val="20"/>
-              </w:rPr>
-              <w:br/>
-              <w:t xml:space="preserve">Sept 15–21</w:t>
-            </w:r>
-          </w:p>
-        </w:tc>
-        <w:tc>
-          <w:tcPr>
-            <w:tcW w:type="dxa" w:w="2500"/>
-            <w:tcMar>
-              <w:top w:type="dxa" w:w="60"/>
-              <w:left w:type="dxa" w:w="90"/>
-              <w:bottom w:type="dxa" w:w="60"/>
-              <w:right w:type="dxa" w:w="90"/>
-            </w:tcMar>
-          </w:tcPr>
-          <w:p>
-            <w:pPr>
-              <w:spacing w:line="240"/>
-            </w:pPr>
-            <w:r>
-              <w:rPr>
-                <w:rFonts w:ascii="Times New Roman" w:cs="Times New Roman" w:eastAsia="Times New Roman" w:hAnsi="Times New Roman"/>
-                <w:b w:val="false"/>
-                <w:bCs w:val="false"/>
-                <w:color w:val="000000"/>
-                <w:sz w:val="20"/>
-                <w:szCs w:val="20"/>
-              </w:rPr>
-              <w:t xml:space="preserve">Movement: Miles for Soles</w:t>
-            </w:r>
-          </w:p>
-        </w:tc>
-        <w:tc>
-          <w:tcPr>
-            <w:tcW w:type="dxa" w:w="2500"/>
-            <w:tcMar>
-              <w:top w:type="dxa" w:w="60"/>
-              <w:left w:type="dxa" w:w="90"/>
-              <w:bottom w:type="dxa" w:w="60"/>
-              <w:right w:type="dxa" w:w="90"/>
-            </w:tcMar>
-          </w:tcPr>
-          <w:p>
-            <w:pPr>
-              <w:spacing w:line="240"/>
-            </w:pPr>
-            <w:r>
-              <w:rPr>
-                <w:rFonts w:ascii="Times New Roman" w:cs="Times New Roman" w:eastAsia="Times New Roman" w:hAnsi="Times New Roman"/>
-                <w:b w:val="false"/>
-                <w:bCs w:val="false"/>
-                <w:color w:val="000000"/>
-                <w:sz w:val="20"/>
-                <w:szCs w:val="20"/>
-              </w:rPr>
-              <w:t xml:space="preserve">IG Reel of Strava totals; TikTok mileage recap; FB sponsor match announcement</w:t>
-            </w:r>
-          </w:p>
-        </w:tc>
-        <w:tc>
-          <w:tcPr>
-            <w:tcW w:type="dxa" w:w="2500"/>
-            <w:tcMar>
-              <w:top w:type="dxa" w:w="60"/>
-              <w:left w:type="dxa" w:w="90"/>
-              <w:bottom w:type="dxa" w:w="60"/>
-              <w:right w:type="dxa" w:w="90"/>
-            </w:tcMar>
-          </w:tcPr>
-          <w:p>
-            <w:pPr>
-              <w:spacing w:line="240"/>
-            </w:pPr>
-            <w:r>
-              <w:rPr>
-                <w:rFonts w:ascii="Times New Roman" w:cs="Times New Roman" w:eastAsia="Times New Roman" w:hAnsi="Times New Roman"/>
-                <w:b w:val="false"/>
-                <w:bCs w:val="false"/>
-                <w:color w:val="000000"/>
-                <w:sz w:val="20"/>
-                <w:szCs w:val="20"/>
-              </w:rPr>
-              <w:t xml:space="preserve">Strava “Miles for Soles” challenge; blog: the science of shoe fit</w:t>
-            </w:r>
-          </w:p>
-        </w:tc>
-      </w:tr>
-      <w:tr>
-        <w:trPr>
-          <w:tblHeader w:val="false"/>
-        </w:trPr>
-        <w:tc>
-          <w:tcPr>
-            <w:tcW w:type="dxa" w:w="1200"/>
-            <w:shd w:fill="EAF0FA" w:color="auto" w:val="clear"/>
-            <w:tcMar>
-              <w:top w:type="dxa" w:w="60"/>
-              <w:left w:type="dxa" w:w="90"/>
-              <w:bottom w:type="dxa" w:w="60"/>
-              <w:right w:type="dxa" w:w="90"/>
-            </w:tcMar>
-          </w:tcPr>
-          <w:p>
-            <w:pPr>
-              <w:spacing w:line="240"/>
-            </w:pPr>
-            <w:r>
-              <w:rPr>
-                <w:rFonts w:ascii="Times New Roman" w:cs="Times New Roman" w:eastAsia="Times New Roman" w:hAnsi="Times New Roman"/>
-                <w:b w:val="false"/>
-                <w:bCs w:val="false"/>
-                <w:color w:val="000000"/>
-                <w:sz w:val="20"/>
-                <w:szCs w:val="20"/>
-              </w:rPr>
-              <w:t xml:space="preserve">Week 4</w:t>
-            </w:r>
-            <w:r>
-              <w:rPr>
-                <w:rFonts w:ascii="Times New Roman" w:cs="Times New Roman" w:eastAsia="Times New Roman" w:hAnsi="Times New Roman"/>
-                <w:b w:val="false"/>
-                <w:bCs w:val="false"/>
-                <w:color w:val="000000"/>
-                <w:sz w:val="20"/>
-                <w:szCs w:val="20"/>
-              </w:rPr>
-              <w:br/>
-              <w:t xml:space="preserve">Sept 22–30</w:t>
-            </w:r>
-          </w:p>
-        </w:tc>
-        <w:tc>
-          <w:tcPr>
-            <w:tcW w:type="dxa" w:w="2500"/>
-            <w:shd w:fill="EAF0FA" w:color="auto" w:val="clear"/>
-            <w:tcMar>
-              <w:top w:type="dxa" w:w="60"/>
-              <w:left w:type="dxa" w:w="90"/>
-              <w:bottom w:type="dxa" w:w="60"/>
-              <w:right w:type="dxa" w:w="90"/>
-            </w:tcMar>
-          </w:tcPr>
-          <w:p>
-            <w:pPr>
-              <w:spacing w:line="240"/>
-            </w:pPr>
-            <w:r>
-              <w:rPr>
-                <w:rFonts w:ascii="Times New Roman" w:cs="Times New Roman" w:eastAsia="Times New Roman" w:hAnsi="Times New Roman"/>
-                <w:b w:val="false"/>
-                <w:bCs w:val="false"/>
-                <w:color w:val="000000"/>
-                <w:sz w:val="20"/>
-                <w:szCs w:val="20"/>
-              </w:rPr>
-              <w:t xml:space="preserve">Impact: dignity delivered</w:t>
-            </w:r>
-          </w:p>
-        </w:tc>
-        <w:tc>
-          <w:tcPr>
-            <w:tcW w:type="dxa" w:w="2500"/>
-            <w:shd w:fill="EAF0FA" w:color="auto" w:val="clear"/>
-            <w:tcMar>
-              <w:top w:type="dxa" w:w="60"/>
-              <w:left w:type="dxa" w:w="90"/>
-              <w:bottom w:type="dxa" w:w="60"/>
-              <w:right w:type="dxa" w:w="90"/>
-            </w:tcMar>
-          </w:tcPr>
-          <w:p>
-            <w:pPr>
-              <w:spacing w:line="240"/>
-            </w:pPr>
-            <w:r>
-              <w:rPr>
-                <w:rFonts w:ascii="Times New Roman" w:cs="Times New Roman" w:eastAsia="Times New Roman" w:hAnsi="Times New Roman"/>
-                <w:b w:val="false"/>
-                <w:bCs w:val="false"/>
-                <w:color w:val="000000"/>
-                <w:sz w:val="20"/>
-                <w:szCs w:val="20"/>
-              </w:rPr>
-              <w:t xml:space="preserve">IG impact carousel; TikTok thank-you montage; FB fundraiser close</w:t>
-            </w:r>
-          </w:p>
-        </w:tc>
-        <w:tc>
-          <w:tcPr>
-            <w:tcW w:type="dxa" w:w="2500"/>
-            <w:shd w:fill="EAF0FA" w:color="auto" w:val="clear"/>
-            <w:tcMar>
-              <w:top w:type="dxa" w:w="60"/>
-              <w:left w:type="dxa" w:w="90"/>
-              <w:bottom w:type="dxa" w:w="60"/>
-              <w:right w:type="dxa" w:w="90"/>
-            </w:tcMar>
-          </w:tcPr>
-          <w:p>
-            <w:pPr>
-              <w:spacing w:line="240"/>
-            </w:pPr>
-            <w:r>
-              <w:rPr>
-                <w:rFonts w:ascii="Times New Roman" w:cs="Times New Roman" w:eastAsia="Times New Roman" w:hAnsi="Times New Roman"/>
-                <w:b w:val="false"/>
-                <w:bCs w:val="false"/>
-                <w:color w:val="000000"/>
-                <w:sz w:val="20"/>
-                <w:szCs w:val="20"/>
-              </w:rPr>
-              <w:t xml:space="preserve">Shoe-Fit “Dignity Quiz”; blog: campaign results + call to give</w:t>
-            </w:r>
-          </w:p>
-        </w:tc>
-      </w:tr>
-    </w:tbl>
-    <w:p>
-      <w:pPr>
-        <w:spacing w:line="480" w:lineRule="auto"/>
-      </w:pPr>
-      <w:r>
-        <w:rPr>
-          <w:rFonts w:ascii="Times New Roman" w:cs="Times New Roman" w:eastAsia="Times New Roman" w:hAnsi="Times New Roman"/>
-          <w:sz w:val="24"/>
-          <w:szCs w:val="24"/>
-        </w:rPr>
-        <w:t xml:space="preserve"/>
+        <w:t xml:space="preserve">The campaign runs across the four weeks of September 2026, with each week organized around a single narrative beat—launch, community, movement, and impact—so that platform activity, mobile engagement, blogging, and user-generated content all reinforce a shared weekly focus without duplicating content.</w:t>
+      </w:r>
+    </w:p>
+    <w:p>
+      <w:pPr>
+        <w:spacing w:line="480" w:lineRule="auto"/>
+        <w:ind w:firstLine="720"/>
+      </w:pPr>
+      <w:r>
+        <w:rPr>
+          <w:rFonts w:ascii="Times New Roman" w:cs="Times New Roman" w:eastAsia="Times New Roman" w:hAnsi="Times New Roman"/>
+          <w:b/>
+          <w:bCs/>
+          <w:sz w:val="24"/>
+          <w:szCs w:val="24"/>
+        </w:rPr>
+        <w:t xml:space="preserve">Week One (September 1–7) launches the campaign under the theme “Sole to Soul.” </w:t>
+      </w:r>
+      <w:r>
+        <w:rPr>
+          <w:rFonts w:ascii="Times New Roman" w:cs="Times New Roman" w:eastAsia="Times New Roman" w:hAnsi="Times New Roman"/>
+          <w:sz w:val="24"/>
+          <w:szCs w:val="24"/>
+        </w:rPr>
+        <w:t xml:space="preserve">Instagram opens with the before-and-after launch carousel, TikTok debuts the workshop-transformation video, and Facebook publishes the event page for the first Saturday collection drive on September 6. The week’s user-generated content is the #SoleToSoulRVA Photo Challenge, the blog runs the founder’s origin story, and the mobile text-to-give option goes live so supporters can act immediately.</w:t>
+      </w:r>
+    </w:p>
+    <w:p>
+      <w:pPr>
+        <w:spacing w:line="480" w:lineRule="auto"/>
+        <w:ind w:firstLine="720"/>
+      </w:pPr>
+      <w:r>
+        <w:rPr>
+          <w:rFonts w:ascii="Times New Roman" w:cs="Times New Roman" w:eastAsia="Times New Roman" w:hAnsi="Times New Roman"/>
+          <w:b/>
+          <w:bCs/>
+          <w:sz w:val="24"/>
+          <w:szCs w:val="24"/>
+        </w:rPr>
+        <w:t xml:space="preserve">Week Two (September 8–14) shifts to community and the question of why running matters. </w:t>
+      </w:r>
+      <w:r>
+        <w:rPr>
+          <w:rFonts w:ascii="Times New Roman" w:cs="Times New Roman" w:eastAsia="Times New Roman" w:hAnsi="Times New Roman"/>
+          <w:sz w:val="24"/>
+          <w:szCs w:val="24"/>
+        </w:rPr>
+        <w:t xml:space="preserve">Instagram uses Stories to run the “Why I Run” prompt, TikTok features runner duets, and Facebook mobilizes local running clubs to host their own collection drives. The “Why I Run” Story prompt serves as the week’s user-generated content, and the blog spotlights a volunteer profile that puts a human face on the refurbishing work.</w:t>
+      </w:r>
+    </w:p>
+    <w:p>
+      <w:pPr>
+        <w:spacing w:line="480" w:lineRule="auto"/>
+        <w:ind w:firstLine="720"/>
+      </w:pPr>
+      <w:r>
+        <w:rPr>
+          <w:rFonts w:ascii="Times New Roman" w:cs="Times New Roman" w:eastAsia="Times New Roman" w:hAnsi="Times New Roman"/>
+          <w:b/>
+          <w:bCs/>
+          <w:sz w:val="24"/>
+          <w:szCs w:val="24"/>
+        </w:rPr>
+        <w:t xml:space="preserve">Week Three (September 15–21) builds momentum around movement through the “Miles for Soles” push. </w:t>
+      </w:r>
+      <w:r>
+        <w:rPr>
+          <w:rFonts w:ascii="Times New Roman" w:cs="Times New Roman" w:eastAsia="Times New Roman" w:hAnsi="Times New Roman"/>
+          <w:sz w:val="24"/>
+          <w:szCs w:val="24"/>
+        </w:rPr>
+        <w:t xml:space="preserve">Instagram shares a Reel showcasing collective Strava totals, TikTok posts a mileage recap, and Facebook announces the sponsor match tied to the challenge. The Strava “Miles for Soles” club challenge is the week’s mobile-driven user-generated content, and the blog explains the science of proper shoe fit to reinforce the dignity theme.</w:t>
+      </w:r>
+    </w:p>
+    <w:p>
+      <w:pPr>
+        <w:spacing w:line="480" w:lineRule="auto"/>
+        <w:ind w:firstLine="720"/>
+      </w:pPr>
+      <w:r>
+        <w:rPr>
+          <w:rFonts w:ascii="Times New Roman" w:cs="Times New Roman" w:eastAsia="Times New Roman" w:hAnsi="Times New Roman"/>
+          <w:b/>
+          <w:bCs/>
+          <w:sz w:val="24"/>
+          <w:szCs w:val="24"/>
+        </w:rPr>
+        <w:t xml:space="preserve">Week Four (September 22–30) closes on impact and dignity delivered. </w:t>
+      </w:r>
+      <w:r>
+        <w:rPr>
+          <w:rFonts w:ascii="Times New Roman" w:cs="Times New Roman" w:eastAsia="Times New Roman" w:hAnsi="Times New Roman"/>
+          <w:sz w:val="24"/>
+          <w:szCs w:val="24"/>
+        </w:rPr>
+        <w:t xml:space="preserve">Instagram publishes an impact carousel, TikTok releases a thank-you montage, and Facebook closes out the fundraiser. The Shoe-Fit “Dignity Quiz” provides the final week’s interactive user-generated content, and the blog delivers a campaign wrap-up reporting results and issuing a closing call to give, volunteer, or donate shoes.</w:t>
       </w:r>
     </w:p>
     <w:p>

</xml_diff>